<commit_message>
3.A.17: ν y 1 − ν para la proporción de tipos en la discriminación de 2.º grado (P21-03)
Co-Authored-By: Claude Opus 5.5 <noreply@anthropic.com>
Claude-Session: https://claude.ai/code/session_01PWJgAjs4PN1Rvp3aLA4tqT
</commit_message>
<xml_diff>
--- a/oposicion/temario/tercer-ejercicio/3A17.docx
+++ b/oposicion/temario/tercer-ejercicio/3A17.docx
@@ -12070,7 +12070,7 @@
       </w:r>
       <m:oMath>
         <m:r>
-          <m:t>π</m:t>
+          <m:t>ν</m:t>
         </m:r>
       </m:oMath>
       <w:r>
@@ -12093,7 +12093,7 @@
           <m:t>−</m:t>
         </m:r>
         <m:r>
-          <m:t>π</m:t>
+          <m:t>ν</m:t>
         </m:r>
       </m:oMath>
       <w:r>
@@ -12561,7 +12561,7 @@
               </m:e>
               <m:e>
                 <m:r>
-                  <m:t>π</m:t>
+                  <m:t>ν</m:t>
                 </m:r>
                 <m:r>
                   <m:t> </m:t>
@@ -12636,7 +12636,7 @@
                       <m:t>−</m:t>
                     </m:r>
                     <m:r>
-                      <m:t>π</m:t>
+                      <m:t>ν</m:t>
                     </m:r>
                   </m:e>
                 </m:d>
@@ -13701,12 +13701,12 @@
                     <m:t>−</m:t>
                   </m:r>
                   <m:r>
-                    <m:t>π</m:t>
+                    <m:t>ν</m:t>
                   </m:r>
                 </m:num>
                 <m:den>
                   <m:r>
-                    <m:t>π</m:t>
+                    <m:t>ν</m:t>
                   </m:r>
                 </m:den>
               </m:f>
@@ -14231,7 +14231,7 @@
               <m:t>−</m:t>
             </m:r>
             <m:r>
-              <m:t>π</m:t>
+              <m:t>ν</m:t>
             </m:r>
           </m:e>
         </m:d>
@@ -14242,7 +14242,7 @@
           <m:t>/</m:t>
         </m:r>
         <m:r>
-          <m:t>π</m:t>
+          <m:t>ν</m:t>
         </m:r>
       </m:oMath>
       <w:r>
@@ -14256,7 +14256,7 @@
       </w:r>
       <m:oMath>
         <m:r>
-          <m:t>π</m:t>
+          <m:t>ν</m:t>
         </m:r>
         <m:r>
           <m:t> </m:t>
@@ -14297,7 +14297,7 @@
               <m:t>−</m:t>
             </m:r>
             <m:r>
-              <m:t>π</m:t>
+              <m:t>ν</m:t>
             </m:r>
           </m:e>
         </m:d>
@@ -44001,7 +44001,7 @@
             <m:t> </m:t>
           </m:r>
           <m:r>
-            <m:t>π</m:t>
+            <m:t>ν</m:t>
           </m:r>
           <m:r>
             <m:t> </m:t>
@@ -44101,7 +44101,7 @@
                 <m:t>−</m:t>
               </m:r>
               <m:r>
-                <m:t>π</m:t>
+                <m:t>ν</m:t>
               </m:r>
             </m:e>
           </m:d>
@@ -44349,7 +44349,7 @@
                 <m:t>−</m:t>
               </m:r>
               <m:r>
-                <m:t>π</m:t>
+                <m:t>ν</m:t>
               </m:r>
             </m:e>
           </m:d>
@@ -44553,7 +44553,7 @@
             <m:t> </m:t>
           </m:r>
           <m:r>
-            <m:t>π</m:t>
+            <m:t>ν</m:t>
           </m:r>
           <m:r>
             <m:t> </m:t>
@@ -44644,7 +44644,7 @@
                 <m:t>−</m:t>
               </m:r>
               <m:r>
-                <m:t>π</m:t>
+                <m:t>ν</m:t>
               </m:r>
             </m:e>
           </m:d>
@@ -44821,12 +44821,12 @@
                     <m:t>−</m:t>
                   </m:r>
                   <m:r>
-                    <m:t>π</m:t>
+                    <m:t>ν</m:t>
                   </m:r>
                 </m:num>
                 <m:den>
                   <m:r>
-                    <m:t>π</m:t>
+                    <m:t>ν</m:t>
                   </m:r>
                 </m:den>
               </m:f>
@@ -45276,7 +45276,7 @@
       </w:r>
       <m:oMath>
         <m:r>
-          <m:t>π</m:t>
+          <m:t>ν</m:t>
         </m:r>
         <m:r>
           <m:t> </m:t>
@@ -45317,7 +45317,7 @@
               <m:t>−</m:t>
             </m:r>
             <m:r>
-              <m:t>π</m:t>
+              <m:t>ν</m:t>
             </m:r>
           </m:e>
         </m:d>
@@ -45517,7 +45517,7 @@
       </w:r>
       <m:oMath>
         <m:r>
-          <m:t>π</m:t>
+          <m:t>ν</m:t>
         </m:r>
       </m:oMath>
       <w:r>
@@ -45622,7 +45622,7 @@
           <m:t>−</m:t>
         </m:r>
         <m:r>
-          <m:t>π</m:t>
+          <m:t>ν</m:t>
         </m:r>
       </m:oMath>
       <w:r>
@@ -46272,12 +46272,12 @@
                   <m:t>−</m:t>
                 </m:r>
                 <m:r>
-                  <m:t>π</m:t>
+                  <m:t>ν</m:t>
                 </m:r>
               </m:num>
               <m:den>
                 <m:r>
-                  <m:t>π</m:t>
+                  <m:t>ν</m:t>
                 </m:r>
               </m:den>
             </m:f>
@@ -64690,7 +64690,7 @@
           <wp:inline>
             <wp:extent cx="2686050" cy="3051713"/>
             <wp:effectExtent b="0" l="0" r="0" t="0"/>
-            <wp:docPr descr="" title="" id="53" name="Picture"/>
+            <wp:docPr descr="Gráfico: tramo elastico" title="" id="53" name="Picture"/>
             <a:graphic>
               <a:graphicData uri="http://schemas.openxmlformats.org/drawingml/2006/picture">
                 <pic:pic>
@@ -65247,7 +65247,7 @@
           <wp:inline>
             <wp:extent cx="3581400" cy="1463391"/>
             <wp:effectExtent b="0" l="0" r="0" t="0"/>
-            <wp:docPr descr="" title="" id="61" name="Picture"/>
+            <wp:docPr descr="Gráfico: monopolio corto plazo" title="" id="61" name="Picture"/>
             <a:graphic>
               <a:graphicData uri="http://schemas.openxmlformats.org/drawingml/2006/picture">
                 <pic:pic>
@@ -65725,7 +65725,7 @@
           <wp:inline>
             <wp:extent cx="5073650" cy="1553950"/>
             <wp:effectExtent b="0" l="0" r="0" t="0"/>
-            <wp:docPr descr="" title="" id="72" name="Picture"/>
+            <wp:docPr descr="Gráfico: escala monopolio" title="" id="72" name="Picture"/>
             <a:graphic>
               <a:graphicData uri="http://schemas.openxmlformats.org/drawingml/2006/picture">
                 <pic:pic>

</xml_diff>